<commit_message>
Enunciado sem atribuicao, grafico proprio de nove classes e numeros ajustados
- Remove do enunciado e do rodape qualquer mencao a adaptacao ou a fonte. O
  credito passa a ficar so no framework interno, porque citar a fonte para o
  membro entrega onde achar a resolucao publicada
- Grafico do Anexo C refeito com a mesma estrutura do original, nove classes de
  ativo, mas com dados proprios e marcado como ficticio. Nao usei a captura de
  tela do case original porque ela traz a marca de terceiro e os numeros
  originais, o que anularia o cuidado de diferenciar
- Auditoria de premissas: populacao e participacao de mulheres estavam
  identicas ao original. Ajustadas para 83,5 milhoes e 50,5%, deixando toda a
  cadeia diferente. Dimensionamento agora da 131.158 usuarias e 2,75 mi
- Template alinhado uma secao por pergunta. Removida a secao de riscos, que nao
  era perguntada no enunciado nem pontuada na rubrica
- Gabarito atualizado no framework
</commit_message>
<xml_diff>
--- a/ciclo-de-cases/semana-01/Case 01 - FemVest (enunciado).docx
+++ b/ciclo-de-cases/semana-01/Case 01 - FemVest (enunciado).docx
@@ -17,7 +17,7 @@
     </w:p>
     <w:p>
       <w:pPr>
-        <w:spacing w:after="160"/>
+        <w:spacing w:after="140"/>
       </w:pPr>
       <w:r>
         <w:rPr>
@@ -30,22 +30,8 @@
     </w:p>
     <w:p>
       <w:pPr>
-        <w:spacing w:after="80"/>
-      </w:pPr>
-      <w:r>
-        <w:rPr>
-          <w:b w:val="0"/>
-          <w:i/>
-          <w:color w:val="475569"/>
-          <w:sz w:val="17"/>
-        </w:rPr>
-        <w:t>Adaptação do case "Launch of a Mobile Neobroker", de autoria da Roland Berger, publicado no PrepLounge. A sequência das quatro perguntas é a do original. O contexto foi reescrito e todos os números dos anexos são próprios do CCU, diferentes dos da versão publicada, então uma resolução encontrada na internet não bate com o nosso gabarito.</w:t>
-      </w:r>
-    </w:p>
-    <w:p>
-      <w:pPr>
         <w:keepNext/>
-        <w:spacing w:before="180" w:after="60"/>
+        <w:spacing w:before="160" w:after="60"/>
         <w:pBdr>
           <w:bottom w:val="single" w:sz="6" w:color="C1272D"/>
         </w:pBdr>
@@ -90,7 +76,7 @@
     <w:p>
       <w:pPr>
         <w:keepNext/>
-        <w:spacing w:before="180" w:after="60"/>
+        <w:spacing w:before="160" w:after="60"/>
         <w:pBdr>
           <w:bottom w:val="single" w:sz="6" w:color="C1272D"/>
         </w:pBdr>
@@ -112,13 +98,13 @@
         <w:tblLook w:firstColumn="1" w:firstRow="1" w:lastColumn="0" w:lastRow="0" w:noHBand="0" w:noVBand="1" w:val="04A0"/>
       </w:tblPr>
       <w:tblGrid>
-        <w:gridCol w:w="5156"/>
-        <w:gridCol w:w="5156"/>
+        <w:gridCol w:w="5213"/>
+        <w:gridCol w:w="5213"/>
       </w:tblGrid>
       <w:tr>
         <w:tc>
           <w:tcPr>
-            <w:tcW w:type="dxa" w:w="6576"/>
+            <w:tcW w:type="dxa" w:w="6690"/>
             <w:shd w:val="clear" w:fill="C1272D"/>
           </w:tcPr>
           <w:p>
@@ -158,7 +144,7 @@
       <w:tr>
         <w:tc>
           <w:tcPr>
-            <w:tcW w:type="dxa" w:w="6576"/>
+            <w:tcW w:type="dxa" w:w="6690"/>
           </w:tcPr>
           <w:p>
             <w:pPr>
@@ -187,7 +173,7 @@
                 <w:color w:val="1E293B"/>
                 <w:sz w:val="19"/>
               </w:rPr>
-              <w:t>84 milhões</w:t>
+              <w:t>83,5 milhões</w:t>
             </w:r>
           </w:p>
         </w:tc>
@@ -195,7 +181,7 @@
       <w:tr>
         <w:tc>
           <w:tcPr>
-            <w:tcW w:type="dxa" w:w="6576"/>
+            <w:tcW w:type="dxa" w:w="6690"/>
             <w:shd w:val="clear" w:fill="F8FAFC"/>
           </w:tcPr>
           <w:p>
@@ -226,7 +212,7 @@
                 <w:color w:val="1E293B"/>
                 <w:sz w:val="19"/>
               </w:rPr>
-              <w:t>50%</w:t>
+              <w:t>50,5%</w:t>
             </w:r>
           </w:p>
         </w:tc>
@@ -234,7 +220,7 @@
       <w:tr>
         <w:tc>
           <w:tcPr>
-            <w:tcW w:type="dxa" w:w="6576"/>
+            <w:tcW w:type="dxa" w:w="6690"/>
           </w:tcPr>
           <w:p>
             <w:pPr>
@@ -271,7 +257,7 @@
       <w:tr>
         <w:tc>
           <w:tcPr>
-            <w:tcW w:type="dxa" w:w="6576"/>
+            <w:tcW w:type="dxa" w:w="6690"/>
             <w:shd w:val="clear" w:fill="F8FAFC"/>
           </w:tcPr>
           <w:p>
@@ -310,7 +296,7 @@
       <w:tr>
         <w:tc>
           <w:tcPr>
-            <w:tcW w:type="dxa" w:w="6576"/>
+            <w:tcW w:type="dxa" w:w="6690"/>
           </w:tcPr>
           <w:p>
             <w:pPr>
@@ -347,7 +333,7 @@
       <w:tr>
         <w:tc>
           <w:tcPr>
-            <w:tcW w:type="dxa" w:w="6576"/>
+            <w:tcW w:type="dxa" w:w="6690"/>
             <w:shd w:val="clear" w:fill="F8FAFC"/>
           </w:tcPr>
           <w:p>
@@ -386,7 +372,7 @@
       <w:tr>
         <w:tc>
           <w:tcPr>
-            <w:tcW w:type="dxa" w:w="6576"/>
+            <w:tcW w:type="dxa" w:w="6690"/>
           </w:tcPr>
           <w:p>
             <w:pPr>
@@ -429,7 +415,7 @@
     <w:p>
       <w:pPr>
         <w:keepNext/>
-        <w:spacing w:before="180" w:after="60"/>
+        <w:spacing w:before="160" w:after="60"/>
         <w:pBdr>
           <w:bottom w:val="single" w:sz="6" w:color="C1272D"/>
         </w:pBdr>
@@ -451,13 +437,13 @@
         <w:tblLook w:firstColumn="1" w:firstRow="1" w:lastColumn="0" w:lastRow="0" w:noHBand="0" w:noVBand="1" w:val="04A0"/>
       </w:tblPr>
       <w:tblGrid>
-        <w:gridCol w:w="5156"/>
-        <w:gridCol w:w="5156"/>
+        <w:gridCol w:w="5213"/>
+        <w:gridCol w:w="5213"/>
       </w:tblGrid>
       <w:tr>
         <w:tc>
           <w:tcPr>
-            <w:tcW w:type="dxa" w:w="6576"/>
+            <w:tcW w:type="dxa" w:w="6690"/>
             <w:shd w:val="clear" w:fill="C1272D"/>
           </w:tcPr>
           <w:p>
@@ -497,7 +483,7 @@
       <w:tr>
         <w:tc>
           <w:tcPr>
-            <w:tcW w:type="dxa" w:w="6576"/>
+            <w:tcW w:type="dxa" w:w="6690"/>
           </w:tcPr>
           <w:p>
             <w:pPr>
@@ -534,7 +520,7 @@
       <w:tr>
         <w:tc>
           <w:tcPr>
-            <w:tcW w:type="dxa" w:w="6576"/>
+            <w:tcW w:type="dxa" w:w="6690"/>
             <w:shd w:val="clear" w:fill="F8FAFC"/>
           </w:tcPr>
           <w:p>
@@ -573,7 +559,7 @@
       <w:tr>
         <w:tc>
           <w:tcPr>
-            <w:tcW w:type="dxa" w:w="6576"/>
+            <w:tcW w:type="dxa" w:w="6690"/>
           </w:tcPr>
           <w:p>
             <w:pPr>
@@ -610,7 +596,7 @@
       <w:tr>
         <w:tc>
           <w:tcPr>
-            <w:tcW w:type="dxa" w:w="6576"/>
+            <w:tcW w:type="dxa" w:w="6690"/>
             <w:shd w:val="clear" w:fill="F8FAFC"/>
           </w:tcPr>
           <w:p>
@@ -649,7 +635,7 @@
       <w:tr>
         <w:tc>
           <w:tcPr>
-            <w:tcW w:type="dxa" w:w="6576"/>
+            <w:tcW w:type="dxa" w:w="6690"/>
           </w:tcPr>
           <w:p>
             <w:pPr>
@@ -686,7 +672,7 @@
       <w:tr>
         <w:tc>
           <w:tcPr>
-            <w:tcW w:type="dxa" w:w="6576"/>
+            <w:tcW w:type="dxa" w:w="6690"/>
             <w:shd w:val="clear" w:fill="F8FAFC"/>
           </w:tcPr>
           <w:p>
@@ -739,13 +725,13 @@
           <w:color w:val="475569"/>
           <w:sz w:val="18"/>
         </w:rPr>
-        <w:t>Atenção: a forma de aplicar o custo de aquisição faz parte do que vocês precisam decidir e justificar. Escrevam na entrega qual premissa adotaram.</w:t>
+        <w:t>A forma de aplicar o custo de aquisição faz parte do que vocês precisam decidir e justificar. Escrevam na entrega qual premissa adotaram.</w:t>
       </w:r>
     </w:p>
     <w:p>
       <w:pPr>
         <w:keepNext/>
-        <w:spacing w:before="180" w:after="60"/>
+        <w:spacing w:before="160" w:after="60"/>
         <w:pBdr>
           <w:bottom w:val="single" w:sz="6" w:color="C1272D"/>
         </w:pBdr>
@@ -761,482 +747,62 @@
     </w:p>
     <w:p>
       <w:pPr>
-        <w:spacing w:after="60"/>
+        <w:spacing w:before="40" w:after="40"/>
+        <w:jc w:val="center"/>
+      </w:pPr>
+      <w:r>
+        <w:drawing>
+          <wp:inline xmlns:a="http://schemas.openxmlformats.org/drawingml/2006/main" xmlns:pic="http://schemas.openxmlformats.org/drawingml/2006/picture">
+            <wp:extent cx="4752000" cy="2489143"/>
+            <wp:docPr id="1" name="Picture 1"/>
+            <wp:cNvGraphicFramePr>
+              <a:graphicFrameLocks noChangeAspect="1"/>
+            </wp:cNvGraphicFramePr>
+            <a:graphic>
+              <a:graphicData uri="http://schemas.openxmlformats.org/drawingml/2006/picture">
+                <pic:pic>
+                  <pic:nvPicPr>
+                    <pic:cNvPr id="0" name="grafico-uso-produto.png"/>
+                    <pic:cNvPicPr/>
+                  </pic:nvPicPr>
+                  <pic:blipFill>
+                    <a:blip r:embed="rId11"/>
+                    <a:stretch>
+                      <a:fillRect/>
+                    </a:stretch>
+                  </pic:blipFill>
+                  <pic:spPr>
+                    <a:xfrm>
+                      <a:off x="0" y="0"/>
+                      <a:ext cx="4752000" cy="2489143"/>
+                    </a:xfrm>
+                    <a:prstGeom prst="rect"/>
+                  </pic:spPr>
+                </pic:pic>
+              </a:graphicData>
+            </a:graphic>
+          </wp:inline>
+        </w:drawing>
+      </w:r>
+    </w:p>
+    <w:p>
+      <w:pPr>
+        <w:spacing w:after="40"/>
       </w:pPr>
       <w:r>
         <w:rPr>
           <w:b w:val="0"/>
-          <w:i w:val="0"/>
+          <w:i/>
           <w:color w:val="475569"/>
-          <w:sz w:val="18"/>
+          <w:sz w:val="17"/>
         </w:rPr>
-        <w:t>Percentual que declara usar ou ter interesse em cada produto, entre investidores de até 35 anos.</w:t>
+        <w:t>A diferença entre as barras é o que justifica a priorização, e ela não vai no mesmo sentido em todas as linhas.</w:t>
       </w:r>
-    </w:p>
-    <w:tbl>
-      <w:tblPr>
-        <w:tblStyle w:val="TableGrid"/>
-        <w:tblW w:type="auto" w:w="0"/>
-        <w:jc w:val="left"/>
-        <w:tblLook w:firstColumn="1" w:firstRow="1" w:lastColumn="0" w:lastRow="0" w:noHBand="0" w:noVBand="1" w:val="04A0"/>
-      </w:tblPr>
-      <w:tblGrid>
-        <w:gridCol w:w="2578"/>
-        <w:gridCol w:w="2578"/>
-        <w:gridCol w:w="2578"/>
-        <w:gridCol w:w="2578"/>
-      </w:tblGrid>
-      <w:tr>
-        <w:tc>
-          <w:tcPr>
-            <w:tcW w:type="dxa" w:w="2835"/>
-            <w:shd w:val="clear" w:fill="C1272D"/>
-          </w:tcPr>
-          <w:p>
-            <w:pPr>
-              <w:spacing w:after="0"/>
-            </w:pPr>
-            <w:r>
-              <w:rPr>
-                <w:b/>
-                <w:color w:val="FFFFFF"/>
-                <w:sz w:val="17"/>
-              </w:rPr>
-              <w:t>Produto</w:t>
-            </w:r>
-          </w:p>
-        </w:tc>
-        <w:tc>
-          <w:tcPr>
-            <w:tcW w:type="dxa" w:w="1814"/>
-            <w:shd w:val="clear" w:fill="C1272D"/>
-          </w:tcPr>
-          <w:p>
-            <w:pPr>
-              <w:spacing w:after="0"/>
-            </w:pPr>
-            <w:r>
-              <w:rPr>
-                <w:b/>
-                <w:color w:val="FFFFFF"/>
-                <w:sz w:val="17"/>
-              </w:rPr>
-              <w:t>Homens</w:t>
-            </w:r>
-          </w:p>
-        </w:tc>
-        <w:tc>
-          <w:tcPr>
-            <w:tcW w:type="dxa" w:w="1814"/>
-            <w:shd w:val="clear" w:fill="C1272D"/>
-          </w:tcPr>
-          <w:p>
-            <w:pPr>
-              <w:spacing w:after="0"/>
-            </w:pPr>
-            <w:r>
-              <w:rPr>
-                <w:b/>
-                <w:color w:val="FFFFFF"/>
-                <w:sz w:val="17"/>
-              </w:rPr>
-              <w:t>Mulheres</w:t>
-            </w:r>
-          </w:p>
-        </w:tc>
-        <w:tc>
-          <w:tcPr>
-            <w:tcW w:type="dxa" w:w="3175"/>
-            <w:shd w:val="clear" w:fill="C1272D"/>
-          </w:tcPr>
-          <w:p>
-            <w:pPr>
-              <w:spacing w:after="0"/>
-            </w:pPr>
-            <w:r>
-              <w:rPr>
-                <w:b/>
-                <w:color w:val="FFFFFF"/>
-                <w:sz w:val="17"/>
-              </w:rPr>
-              <w:t>Diferença</w:t>
-            </w:r>
-          </w:p>
-        </w:tc>
-      </w:tr>
-      <w:tr>
-        <w:tc>
-          <w:tcPr>
-            <w:tcW w:type="dxa" w:w="2835"/>
-          </w:tcPr>
-          <w:p>
-            <w:pPr>
-              <w:spacing w:after="0"/>
-            </w:pPr>
-            <w:r>
-              <w:rPr>
-                <w:b/>
-                <w:color w:val="1E293B"/>
-                <w:sz w:val="18"/>
-              </w:rPr>
-              <w:t>ETFs</w:t>
-            </w:r>
-          </w:p>
-        </w:tc>
-        <w:tc>
-          <w:tcPr>
-            <w:tcW w:type="dxa" w:w="1814"/>
-          </w:tcPr>
-          <w:p>
-            <w:pPr>
-              <w:spacing w:after="0"/>
-            </w:pPr>
-            <w:r>
-              <w:rPr>
-                <w:color w:val="1E293B"/>
-                <w:sz w:val="18"/>
-              </w:rPr>
-              <w:t>81%</w:t>
-            </w:r>
-          </w:p>
-        </w:tc>
-        <w:tc>
-          <w:tcPr>
-            <w:tcW w:type="dxa" w:w="1814"/>
-          </w:tcPr>
-          <w:p>
-            <w:pPr>
-              <w:spacing w:after="0"/>
-            </w:pPr>
-            <w:r>
-              <w:rPr>
-                <w:color w:val="1E293B"/>
-                <w:sz w:val="18"/>
-              </w:rPr>
-              <w:t>79%</w:t>
-            </w:r>
-          </w:p>
-        </w:tc>
-        <w:tc>
-          <w:tcPr>
-            <w:tcW w:type="dxa" w:w="3175"/>
-          </w:tcPr>
-          <w:p>
-            <w:pPr>
-              <w:spacing w:after="0"/>
-            </w:pPr>
-            <w:r>
-              <w:rPr>
-                <w:color w:val="1E293B"/>
-                <w:sz w:val="18"/>
-              </w:rPr>
-              <w:t>2 p.p.</w:t>
-            </w:r>
-          </w:p>
-        </w:tc>
-      </w:tr>
-      <w:tr>
-        <w:tc>
-          <w:tcPr>
-            <w:tcW w:type="dxa" w:w="2835"/>
-            <w:shd w:val="clear" w:fill="F8FAFC"/>
-          </w:tcPr>
-          <w:p>
-            <w:pPr>
-              <w:spacing w:after="0"/>
-            </w:pPr>
-            <w:r>
-              <w:rPr>
-                <w:b/>
-                <w:color w:val="1E293B"/>
-                <w:sz w:val="18"/>
-              </w:rPr>
-              <w:t>Ações individuais</w:t>
-            </w:r>
-          </w:p>
-        </w:tc>
-        <w:tc>
-          <w:tcPr>
-            <w:tcW w:type="dxa" w:w="1814"/>
-            <w:shd w:val="clear" w:fill="F8FAFC"/>
-          </w:tcPr>
-          <w:p>
-            <w:pPr>
-              <w:spacing w:after="0"/>
-            </w:pPr>
-            <w:r>
-              <w:rPr>
-                <w:color w:val="1E293B"/>
-                <w:sz w:val="18"/>
-              </w:rPr>
-              <w:t>71%</w:t>
-            </w:r>
-          </w:p>
-        </w:tc>
-        <w:tc>
-          <w:tcPr>
-            <w:tcW w:type="dxa" w:w="1814"/>
-            <w:shd w:val="clear" w:fill="F8FAFC"/>
-          </w:tcPr>
-          <w:p>
-            <w:pPr>
-              <w:spacing w:after="0"/>
-            </w:pPr>
-            <w:r>
-              <w:rPr>
-                <w:color w:val="1E293B"/>
-                <w:sz w:val="18"/>
-              </w:rPr>
-              <w:t>52%</w:t>
-            </w:r>
-          </w:p>
-        </w:tc>
-        <w:tc>
-          <w:tcPr>
-            <w:tcW w:type="dxa" w:w="3175"/>
-            <w:shd w:val="clear" w:fill="F8FAFC"/>
-          </w:tcPr>
-          <w:p>
-            <w:pPr>
-              <w:spacing w:after="0"/>
-            </w:pPr>
-            <w:r>
-              <w:rPr>
-                <w:color w:val="1E293B"/>
-                <w:sz w:val="18"/>
-              </w:rPr>
-              <w:t>19 p.p.</w:t>
-            </w:r>
-          </w:p>
-        </w:tc>
-      </w:tr>
-      <w:tr>
-        <w:tc>
-          <w:tcPr>
-            <w:tcW w:type="dxa" w:w="2835"/>
-          </w:tcPr>
-          <w:p>
-            <w:pPr>
-              <w:spacing w:after="0"/>
-            </w:pPr>
-            <w:r>
-              <w:rPr>
-                <w:b/>
-                <w:color w:val="1E293B"/>
-                <w:sz w:val="18"/>
-              </w:rPr>
-              <w:t>Poupança e renda fixa</w:t>
-            </w:r>
-          </w:p>
-        </w:tc>
-        <w:tc>
-          <w:tcPr>
-            <w:tcW w:type="dxa" w:w="1814"/>
-          </w:tcPr>
-          <w:p>
-            <w:pPr>
-              <w:spacing w:after="0"/>
-            </w:pPr>
-            <w:r>
-              <w:rPr>
-                <w:color w:val="1E293B"/>
-                <w:sz w:val="18"/>
-              </w:rPr>
-              <w:t>33%</w:t>
-            </w:r>
-          </w:p>
-        </w:tc>
-        <w:tc>
-          <w:tcPr>
-            <w:tcW w:type="dxa" w:w="1814"/>
-          </w:tcPr>
-          <w:p>
-            <w:pPr>
-              <w:spacing w:after="0"/>
-            </w:pPr>
-            <w:r>
-              <w:rPr>
-                <w:color w:val="1E293B"/>
-                <w:sz w:val="18"/>
-              </w:rPr>
-              <w:t>36%</w:t>
-            </w:r>
-          </w:p>
-        </w:tc>
-        <w:tc>
-          <w:tcPr>
-            <w:tcW w:type="dxa" w:w="3175"/>
-          </w:tcPr>
-          <w:p>
-            <w:pPr>
-              <w:spacing w:after="0"/>
-            </w:pPr>
-            <w:r>
-              <w:rPr>
-                <w:color w:val="1E293B"/>
-                <w:sz w:val="18"/>
-              </w:rPr>
-              <w:t>3 p.p. a favor das mulheres</w:t>
-            </w:r>
-          </w:p>
-        </w:tc>
-      </w:tr>
-      <w:tr>
-        <w:tc>
-          <w:tcPr>
-            <w:tcW w:type="dxa" w:w="2835"/>
-            <w:shd w:val="clear" w:fill="F8FAFC"/>
-          </w:tcPr>
-          <w:p>
-            <w:pPr>
-              <w:spacing w:after="0"/>
-            </w:pPr>
-            <w:r>
-              <w:rPr>
-                <w:b/>
-                <w:color w:val="1E293B"/>
-                <w:sz w:val="18"/>
-              </w:rPr>
-              <w:t>Criptomoedas</w:t>
-            </w:r>
-          </w:p>
-        </w:tc>
-        <w:tc>
-          <w:tcPr>
-            <w:tcW w:type="dxa" w:w="1814"/>
-            <w:shd w:val="clear" w:fill="F8FAFC"/>
-          </w:tcPr>
-          <w:p>
-            <w:pPr>
-              <w:spacing w:after="0"/>
-            </w:pPr>
-            <w:r>
-              <w:rPr>
-                <w:color w:val="1E293B"/>
-                <w:sz w:val="18"/>
-              </w:rPr>
-              <w:t>41%</w:t>
-            </w:r>
-          </w:p>
-        </w:tc>
-        <w:tc>
-          <w:tcPr>
-            <w:tcW w:type="dxa" w:w="1814"/>
-            <w:shd w:val="clear" w:fill="F8FAFC"/>
-          </w:tcPr>
-          <w:p>
-            <w:pPr>
-              <w:spacing w:after="0"/>
-            </w:pPr>
-            <w:r>
-              <w:rPr>
-                <w:color w:val="1E293B"/>
-                <w:sz w:val="18"/>
-              </w:rPr>
-              <w:t>15%</w:t>
-            </w:r>
-          </w:p>
-        </w:tc>
-        <w:tc>
-          <w:tcPr>
-            <w:tcW w:type="dxa" w:w="3175"/>
-            <w:shd w:val="clear" w:fill="F8FAFC"/>
-          </w:tcPr>
-          <w:p>
-            <w:pPr>
-              <w:spacing w:after="0"/>
-            </w:pPr>
-            <w:r>
-              <w:rPr>
-                <w:color w:val="1E293B"/>
-                <w:sz w:val="18"/>
-              </w:rPr>
-              <w:t>26 p.p.</w:t>
-            </w:r>
-          </w:p>
-        </w:tc>
-      </w:tr>
-      <w:tr>
-        <w:tc>
-          <w:tcPr>
-            <w:tcW w:type="dxa" w:w="2835"/>
-          </w:tcPr>
-          <w:p>
-            <w:pPr>
-              <w:spacing w:after="0"/>
-            </w:pPr>
-            <w:r>
-              <w:rPr>
-                <w:b/>
-                <w:color w:val="1E293B"/>
-                <w:sz w:val="18"/>
-              </w:rPr>
-              <w:t>Fundos temáticos e ESG</w:t>
-            </w:r>
-          </w:p>
-        </w:tc>
-        <w:tc>
-          <w:tcPr>
-            <w:tcW w:type="dxa" w:w="1814"/>
-          </w:tcPr>
-          <w:p>
-            <w:pPr>
-              <w:spacing w:after="0"/>
-            </w:pPr>
-            <w:r>
-              <w:rPr>
-                <w:color w:val="1E293B"/>
-                <w:sz w:val="18"/>
-              </w:rPr>
-              <w:t>22%</w:t>
-            </w:r>
-          </w:p>
-        </w:tc>
-        <w:tc>
-          <w:tcPr>
-            <w:tcW w:type="dxa" w:w="1814"/>
-          </w:tcPr>
-          <w:p>
-            <w:pPr>
-              <w:spacing w:after="0"/>
-            </w:pPr>
-            <w:r>
-              <w:rPr>
-                <w:color w:val="1E293B"/>
-                <w:sz w:val="18"/>
-              </w:rPr>
-              <w:t>34%</w:t>
-            </w:r>
-          </w:p>
-        </w:tc>
-        <w:tc>
-          <w:tcPr>
-            <w:tcW w:type="dxa" w:w="3175"/>
-          </w:tcPr>
-          <w:p>
-            <w:pPr>
-              <w:spacing w:after="0"/>
-            </w:pPr>
-            <w:r>
-              <w:rPr>
-                <w:color w:val="1E293B"/>
-                <w:sz w:val="18"/>
-              </w:rPr>
-              <w:t>12 p.p. a favor das mulheres</w:t>
-            </w:r>
-          </w:p>
-        </w:tc>
-      </w:tr>
-    </w:tbl>
-    <w:p>
-      <w:pPr>
-        <w:spacing w:after="0"/>
-      </w:pPr>
     </w:p>
     <w:p>
       <w:pPr>
         <w:keepNext/>
-        <w:spacing w:before="180" w:after="60"/>
+        <w:spacing w:before="160" w:after="60"/>
         <w:pBdr>
           <w:bottom w:val="single" w:sz="6" w:color="C1272D"/>
         </w:pBdr>
@@ -1260,14 +826,14 @@
         <w:rPr>
           <w:b/>
           <w:color w:val="1E293B"/>
-          <w:sz w:val="20"/>
+          <w:sz w:val="19"/>
         </w:rPr>
         <w:t xml:space="preserve">Preferências do público: </w:t>
       </w:r>
       <w:r>
         <w:rPr>
           <w:color w:val="1E293B"/>
-          <w:sz w:val="20"/>
+          <w:sz w:val="19"/>
         </w:rPr>
         <w:t>autosserviço no dia a dia, com apoio consultivo disponível quando necessário. Sinais de segurança e confiança pesam muito. Taxa baixa é o principal critério de escolha de corretora.</w:t>
       </w:r>
@@ -1282,14 +848,14 @@
         <w:rPr>
           <w:b/>
           <w:color w:val="1E293B"/>
-          <w:sz w:val="20"/>
+          <w:sz w:val="19"/>
         </w:rPr>
         <w:t xml:space="preserve">O que o setor já trata como obrigatório: </w:t>
       </w:r>
       <w:r>
         <w:rPr>
           <w:color w:val="1E293B"/>
-          <w:sz w:val="20"/>
+          <w:sz w:val="19"/>
         </w:rPr>
         <w:t>aplicativo em primeiro lugar, liderança de custo, elementos de jogo e velocidade de execução.</w:t>
       </w:r>
@@ -1304,36 +870,44 @@
         <w:rPr>
           <w:b/>
           <w:color w:val="1E293B"/>
-          <w:sz w:val="20"/>
+          <w:sz w:val="19"/>
         </w:rPr>
         <w:t xml:space="preserve">Necessidades específicas do público-alvo: </w:t>
       </w:r>
       <w:r>
         <w:rPr>
           <w:color w:val="1E293B"/>
-          <w:sz w:val="20"/>
+          <w:sz w:val="19"/>
         </w:rPr>
         <w:t>segurança, transparência, ESG, comunidade e educação financeira sem jargão.</w:t>
       </w:r>
     </w:p>
     <w:p>
       <w:pPr>
-        <w:spacing w:after="80"/>
+        <w:pStyle w:val="ListBullet"/>
+        <w:spacing w:after="20"/>
+        <w:ind w:left="312"/>
       </w:pPr>
       <w:r>
         <w:rPr>
-          <w:b w:val="0"/>
-          <w:i/>
-          <w:color w:val="475569"/>
-          <w:sz w:val="18"/>
+          <w:b/>
+          <w:color w:val="1E293B"/>
+          <w:sz w:val="19"/>
         </w:rPr>
-        <w:t>Nota do CCU, fora do case original: o pagamento por direcionamento de ordens, o PFOF, está proibido na União Europeia pelo artigo 39a do MiFIR, e desde 1º de julho de 2026 a proibição vale integralmente na Alemanha. Vale considerar isso ao propor o modelo de receita.</w:t>
+        <w:t xml:space="preserve">Restrição regulatória: </w:t>
+      </w:r>
+      <w:r>
+        <w:rPr>
+          <w:color w:val="1E293B"/>
+          <w:sz w:val="19"/>
+        </w:rPr>
+        <w:t>o pagamento por direcionamento de ordens, o PFOF, está proibido na União Europeia pelo artigo 39a do MiFIR, e desde 1º de julho de 2026 a proibição vale integralmente na Alemanha.</w:t>
       </w:r>
     </w:p>
     <w:p>
       <w:pPr>
         <w:keepNext/>
-        <w:spacing w:before="180" w:after="60"/>
+        <w:spacing w:before="160" w:after="60"/>
         <w:pBdr>
           <w:bottom w:val="single" w:sz="6" w:color="C1272D"/>
         </w:pBdr>
@@ -1430,7 +1004,7 @@
     <w:p>
       <w:pPr>
         <w:keepNext/>
-        <w:spacing w:before="180" w:after="60"/>
+        <w:spacing w:before="160" w:after="60"/>
         <w:pBdr>
           <w:bottom w:val="single" w:sz="6" w:color="C1272D"/>
         </w:pBdr>
@@ -1518,7 +1092,7 @@
       <w:headerReference w:type="default" r:id="rId9"/>
       <w:footerReference w:type="default" r:id="rId10"/>
       <w:pgSz w:w="12240" w:h="15840"/>
-      <w:pgMar w:top="680" w:right="964" w:bottom="680" w:left="964" w:header="720" w:footer="720" w:gutter="0"/>
+      <w:pgMar w:top="680" w:right="907" w:bottom="624" w:left="907" w:header="720" w:footer="720" w:gutter="0"/>
       <w:cols w:space="720"/>
       <w:docGrid w:linePitch="360"/>
     </w:sectPr>
@@ -1537,7 +1111,7 @@
         <w:color w:val="475569"/>
         <w:sz w:val="15"/>
       </w:rPr>
-      <w:t>Adaptado pelo CCU do case público da Roland Berger no PrepLounge  ·  uso interno de treinamento</w:t>
+      <w:t>Clube de Consultoria Universitário  ·  Gestão de Pessoas  ·  uso interno de treinamento</w:t>
     </w:r>
   </w:p>
 </w:ftr>
@@ -1549,7 +1123,7 @@
     <w:pPr>
       <w:pStyle w:val="Header"/>
       <w:tabs>
-        <w:tab w:pos="9978" w:val="right"/>
+        <w:tab w:pos="10091" w:val="right"/>
       </w:tabs>
     </w:pPr>
     <w:r>

</xml_diff>

<commit_message>
Refaz o grafico do Anexo C com identidade visual do CCU
- Titulo em vermelho CCU com filete, subtitulo em cinza e logo no canto
  superior direito, no mesmo padrao dos documentos
- Barras em vermelho CCU para mulheres e cinza-azulado para homens, com
  rotulo de valor em cada barra
- Filete vertical vermelho marcando o eixo, legenda movida para o canto
  inferior direito para nao cobrir o subtitulo nem as barras
- Nove classes de ativo com numeros proprios, marcado como dado ficticio
- Integrado no enunciado, que segue em duas paginas
</commit_message>
<xml_diff>
--- a/ciclo-de-cases/semana-01/Case 01 - FemVest (enunciado).docx
+++ b/ciclo-de-cases/semana-01/Case 01 - FemVest (enunciado).docx
@@ -753,7 +753,7 @@
       <w:r>
         <w:drawing>
           <wp:inline xmlns:a="http://schemas.openxmlformats.org/drawingml/2006/main" xmlns:pic="http://schemas.openxmlformats.org/drawingml/2006/picture">
-            <wp:extent cx="4752000" cy="2489143"/>
+            <wp:extent cx="4752000" cy="2790486"/>
             <wp:docPr id="1" name="Picture 1"/>
             <wp:cNvGraphicFramePr>
               <a:graphicFrameLocks noChangeAspect="1"/>
@@ -774,7 +774,7 @@
                   <pic:spPr>
                     <a:xfrm>
                       <a:off x="0" y="0"/>
-                      <a:ext cx="4752000" cy="2489143"/>
+                      <a:ext cx="4752000" cy="2790486"/>
                     </a:xfrm>
                     <a:prstGeom prst="rect"/>
                   </pic:spPr>

</xml_diff>